<commit_message>
Update Master Resume: task force lead role, remove data virtualization label
Co-Authored-By: Claude Sonnet 5.5 <noreply@anthropic.com>
Claude-Session: https://claude.ai/code/session_018EDbvEDmLFvQq3cYtnykCU
</commit_message>
<xml_diff>
--- a/out/Master_Resume_Sukwoo_Chung_2_updated.docx
+++ b/out/Master_Resume_Sukwoo_Chung_2_updated.docx
@@ -704,7 +704,7 @@
           <w:vertAlign w:val="baseline"/>
           <w:rtl w:val="0"/>
         </w:rPr>
-        <w:t xml:space="preserve">Serving as </w:t>
+        <w:t xml:space="preserve">Leading </w:t>
       </w:r>
       <w:r>
         <w:rPr>
@@ -723,7 +723,7 @@
           <w:vertAlign w:val="baseline"/>
           <w:rtl w:val="0"/>
         </w:rPr>
-        <w:t xml:space="preserve">second-in-command on a standing 6-person task force</w:t>
+        <w:t xml:space="preserve">a standing 6-person task force</w:t>
       </w:r>
       <w:r>
         <w:rPr>
@@ -3291,7 +3291,7 @@
           <w:vertAlign w:val="baseline"/>
           <w:rtl w:val="0"/>
         </w:rPr>
-        <w:t xml:space="preserve">People leadership: 5 direct reports (Korean Air Philippines Office), 4 mentees (Korean Air Revenue Management), 2-person co-lead position on a 6-person standing task force (Samsung SDS).</w:t>
+        <w:t xml:space="preserve">People leadership: 5 direct reports (Korean Air Philippines Office), 4 mentees (Korean Air Revenue Management), lead of a 6-person standing task force (Samsung SDS).</w:t>
       </w:r>
     </w:p>
     <w:p>
@@ -4527,7 +4527,7 @@
           <w:vertAlign w:val="baseline"/>
           <w:rtl w:val="0"/>
         </w:rPr>
-        <w:t xml:space="preserve">Power BI, Tableau, Oracle BI, Google Analytics (data virtualization), Oracle Siebel CRM, Microsoft (Excel, Access, PowerPoint), Google Workspace.</w:t>
+        <w:t xml:space="preserve">Power BI, Tableau, Oracle BI, Google Analytics, Oracle Siebel CRM, Microsoft (Excel, Access, PowerPoint), Google Workspace.</w:t>
       </w:r>
     </w:p>
     <w:p>

</xml_diff>